<commit_message>
Compare use-case pages with competitors and simplify the copy
Adds a competitor comparison (Fireflies, Otter, Notta, Jump, Zocks,
Geekbot), and to all 10 pages an 'In simple words' section, a 'Who
it's for' list, a without/with Lynkk table and a 'Works with' line.
Replaces jargon and rebuilds the Word files.

Co-Authored-By: Claude Opus 5.5 <noreply@anthropic.com>
Claude-Session: https://claude.ai/code/session_01Xs6uEGTRa4UggVmKjUH61X
</commit_message>
<xml_diff>
--- a/content/use-cases/lynkk-customer-research-page-short.docx
+++ b/content/use-cases/lynkk-customer-research-page-short.docx
@@ -544,7 +544,7 @@
         <w:spacing w:after="140"/>
       </w:pPr>
       <w:r>
-        <w:t xml:space="preserve">7 blocks, about 450 words. One centred column, white background, light grey cards. Columns stack on mobile.</w:t>
+        <w:t xml:space="preserve">9 blocks, about 660 words. One centred column, white background, light grey cards. Columns stack on mobile.</w:t>
       </w:r>
     </w:p>
     <w:p>
@@ -743,7 +743,142 @@
           <w:sz w:val="17"/>
           <w:szCs w:val="17"/>
         </w:rPr>
-        <w:t xml:space="preserve">2. HOW IT WORKS</w:t>
+        <w:t xml:space="preserve">2. IN SIMPLE WORDS</w:t>
+      </w:r>
+    </w:p>
+    <w:tbl>
+      <w:tblPr>
+        <w:tblW w:type="dxa" w:w="10080"/>
+        <w:tblBorders>
+          <w:top w:val="single" w:color="auto" w:sz="4"/>
+          <w:left w:val="single" w:color="auto" w:sz="4"/>
+          <w:bottom w:val="single" w:color="auto" w:sz="4"/>
+          <w:right w:val="single" w:color="auto" w:sz="4"/>
+          <w:insideH w:val="single" w:color="auto" w:sz="4"/>
+          <w:insideV w:val="single" w:color="auto" w:sz="4"/>
+        </w:tblBorders>
+      </w:tblPr>
+      <w:tblGrid>
+        <w:gridCol w:w="5040"/>
+        <w:gridCol w:w="5040"/>
+      </w:tblGrid>
+      <w:tr>
+        <w:tc>
+          <w:tcPr>
+            <w:tcW w:type="dxa" w:w="5040"/>
+            <w:tcBorders>
+              <w:top w:val="dashed" w:color="9CA3AF" w:sz="6"/>
+              <w:left w:val="dashed" w:color="9CA3AF" w:sz="6"/>
+              <w:bottom w:val="dashed" w:color="9CA3AF" w:sz="6"/>
+              <w:right w:val="dashed" w:color="9CA3AF" w:sz="6"/>
+            </w:tcBorders>
+            <w:shd w:fill="F5F6F8" w:color="auto" w:val="clear"/>
+            <w:tcMar>
+              <w:top w:type="dxa" w:w="100"/>
+              <w:left w:type="dxa" w:w="120"/>
+              <w:bottom w:type="dxa" w:w="100"/>
+              <w:right w:type="dxa" w:w="120"/>
+            </w:tcMar>
+          </w:tcPr>
+          <w:p>
+            <w:pPr>
+              <w:spacing w:after="40"/>
+              <w:jc w:val="left"/>
+            </w:pPr>
+            <w:r>
+              <w:rPr>
+                <w:b/>
+                <w:bCs/>
+                <w:color w:val="1F3A5F"/>
+                <w:sz w:val="18"/>
+                <w:szCs w:val="18"/>
+              </w:rPr>
+              <w:t xml:space="preserve">WHAT IT IS</w:t>
+            </w:r>
+          </w:p>
+          <w:p>
+            <w:pPr>
+              <w:spacing w:after="40"/>
+              <w:jc w:val="left"/>
+            </w:pPr>
+            <w:r>
+              <w:rPr>
+                <w:b w:val="false"/>
+                <w:bCs w:val="false"/>
+                <w:color w:val="4B5563"/>
+                <w:sz w:val="18"/>
+                <w:szCs w:val="18"/>
+              </w:rPr>
+              <w:t xml:space="preserve">2-3 simple sentences</w:t>
+            </w:r>
+          </w:p>
+        </w:tc>
+        <w:tc>
+          <w:tcPr>
+            <w:tcW w:type="dxa" w:w="5040"/>
+            <w:tcBorders>
+              <w:top w:val="dashed" w:color="9CA3AF" w:sz="6"/>
+              <w:left w:val="dashed" w:color="9CA3AF" w:sz="6"/>
+              <w:bottom w:val="dashed" w:color="9CA3AF" w:sz="6"/>
+              <w:right w:val="dashed" w:color="9CA3AF" w:sz="6"/>
+            </w:tcBorders>
+            <w:shd w:fill="F5F6F8" w:color="auto" w:val="clear"/>
+            <w:tcMar>
+              <w:top w:type="dxa" w:w="100"/>
+              <w:left w:type="dxa" w:w="120"/>
+              <w:bottom w:type="dxa" w:w="100"/>
+              <w:right w:type="dxa" w:w="120"/>
+            </w:tcMar>
+          </w:tcPr>
+          <w:p>
+            <w:pPr>
+              <w:spacing w:after="40"/>
+              <w:jc w:val="left"/>
+            </w:pPr>
+            <w:r>
+              <w:rPr>
+                <w:b/>
+                <w:bCs/>
+                <w:color w:val="1F3A5F"/>
+                <w:sz w:val="18"/>
+                <w:szCs w:val="18"/>
+              </w:rPr>
+              <w:t xml:space="preserve">WHO IT'S FOR</w:t>
+            </w:r>
+          </w:p>
+          <w:p>
+            <w:pPr>
+              <w:spacing w:after="40"/>
+              <w:jc w:val="left"/>
+            </w:pPr>
+            <w:r>
+              <w:rPr>
+                <w:b w:val="false"/>
+                <w:bCs w:val="false"/>
+                <w:color w:val="4B5563"/>
+                <w:sz w:val="18"/>
+                <w:szCs w:val="18"/>
+              </w:rPr>
+              <w:t xml:space="preserve">3 short lines</w:t>
+            </w:r>
+          </w:p>
+        </w:tc>
+      </w:tr>
+    </w:tbl>
+    <w:p>
+      <w:pPr>
+        <w:spacing w:after="60" w:before="160"/>
+      </w:pPr>
+      <w:r>
+        <w:rPr>
+          <w:b/>
+          <w:bCs/>
+          <w:caps/>
+          <w:color w:val="6B7280"/>
+          <w:sz w:val="17"/>
+          <w:szCs w:val="17"/>
+        </w:rPr>
+        <w:t xml:space="preserve">3. HOW IT WORKS</w:t>
       </w:r>
     </w:p>
     <w:tbl>
@@ -929,7 +1064,7 @@
           <w:sz w:val="17"/>
           <w:szCs w:val="17"/>
         </w:rPr>
-        <w:t xml:space="preserve">3. SAMPLE ANSWER</w:t>
+        <w:t xml:space="preserve">4. SAMPLE ANSWER</w:t>
       </w:r>
     </w:p>
     <w:tbl>
@@ -1026,7 +1161,7 @@
                 <w:sz w:val="18"/>
                 <w:szCs w:val="18"/>
               </w:rPr>
-              <w:t xml:space="preserve">Cited calls</w:t>
+              <w:t xml:space="preserve">Where it came from</w:t>
             </w:r>
           </w:p>
         </w:tc>
@@ -1045,7 +1180,7 @@
           <w:sz w:val="17"/>
           <w:szCs w:val="17"/>
         </w:rPr>
-        <w:t xml:space="preserve">4. FEATURES (2 x 2 cards)</w:t>
+        <w:t xml:space="preserve">5. FEATURES (2 x 2 cards)</w:t>
       </w:r>
     </w:p>
     <w:tbl>
@@ -1235,7 +1370,158 @@
           <w:sz w:val="17"/>
           <w:szCs w:val="17"/>
         </w:rPr>
-        <w:t xml:space="preserve">5. PRIVACY (one line of 4 badges)</w:t>
+        <w:t xml:space="preserve">6. BEFORE AND AFTER</w:t>
+      </w:r>
+    </w:p>
+    <w:tbl>
+      <w:tblPr>
+        <w:tblW w:type="dxa" w:w="10080"/>
+        <w:tblBorders>
+          <w:top w:val="single" w:color="auto" w:sz="4"/>
+          <w:left w:val="single" w:color="auto" w:sz="4"/>
+          <w:bottom w:val="single" w:color="auto" w:sz="4"/>
+          <w:right w:val="single" w:color="auto" w:sz="4"/>
+          <w:insideH w:val="single" w:color="auto" w:sz="4"/>
+          <w:insideV w:val="single" w:color="auto" w:sz="4"/>
+        </w:tblBorders>
+      </w:tblPr>
+      <w:tblGrid>
+        <w:gridCol w:w="5040"/>
+        <w:gridCol w:w="5040"/>
+      </w:tblGrid>
+      <w:tr>
+        <w:tc>
+          <w:tcPr>
+            <w:tcW w:type="dxa" w:w="5040"/>
+            <w:tcBorders>
+              <w:top w:val="dashed" w:color="9CA3AF" w:sz="6"/>
+              <w:left w:val="dashed" w:color="9CA3AF" w:sz="6"/>
+              <w:bottom w:val="dashed" w:color="9CA3AF" w:sz="6"/>
+              <w:right w:val="dashed" w:color="9CA3AF" w:sz="6"/>
+            </w:tcBorders>
+            <w:shd w:fill="F5F6F8" w:color="auto" w:val="clear"/>
+            <w:tcMar>
+              <w:top w:type="dxa" w:w="100"/>
+              <w:left w:type="dxa" w:w="120"/>
+              <w:bottom w:type="dxa" w:w="100"/>
+              <w:right w:type="dxa" w:w="120"/>
+            </w:tcMar>
+          </w:tcPr>
+          <w:p>
+            <w:pPr>
+              <w:spacing w:after="40"/>
+              <w:jc w:val="left"/>
+            </w:pPr>
+            <w:r>
+              <w:rPr>
+                <w:b/>
+                <w:bCs/>
+                <w:color w:val="1F3A5F"/>
+                <w:sz w:val="18"/>
+                <w:szCs w:val="18"/>
+              </w:rPr>
+              <w:t xml:space="preserve">WITHOUT LYNKK</w:t>
+            </w:r>
+          </w:p>
+          <w:p>
+            <w:pPr>
+              <w:spacing w:after="40"/>
+              <w:jc w:val="left"/>
+            </w:pPr>
+            <w:r>
+              <w:rPr>
+                <w:b w:val="false"/>
+                <w:bCs w:val="false"/>
+                <w:color w:val="4B5563"/>
+                <w:sz w:val="18"/>
+                <w:szCs w:val="18"/>
+              </w:rPr>
+              <w:t xml:space="preserve">3 short rows</w:t>
+            </w:r>
+          </w:p>
+        </w:tc>
+        <w:tc>
+          <w:tcPr>
+            <w:tcW w:type="dxa" w:w="5040"/>
+            <w:tcBorders>
+              <w:top w:val="dashed" w:color="9CA3AF" w:sz="6"/>
+              <w:left w:val="dashed" w:color="9CA3AF" w:sz="6"/>
+              <w:bottom w:val="dashed" w:color="9CA3AF" w:sz="6"/>
+              <w:right w:val="dashed" w:color="9CA3AF" w:sz="6"/>
+            </w:tcBorders>
+            <w:shd w:fill="F5F6F8" w:color="auto" w:val="clear"/>
+            <w:tcMar>
+              <w:top w:type="dxa" w:w="100"/>
+              <w:left w:type="dxa" w:w="120"/>
+              <w:bottom w:type="dxa" w:w="100"/>
+              <w:right w:type="dxa" w:w="120"/>
+            </w:tcMar>
+          </w:tcPr>
+          <w:p>
+            <w:pPr>
+              <w:spacing w:after="40"/>
+              <w:jc w:val="left"/>
+            </w:pPr>
+            <w:r>
+              <w:rPr>
+                <w:b/>
+                <w:bCs/>
+                <w:color w:val="1F3A5F"/>
+                <w:sz w:val="18"/>
+                <w:szCs w:val="18"/>
+              </w:rPr>
+              <w:t xml:space="preserve">WITH LYNKK</w:t>
+            </w:r>
+          </w:p>
+          <w:p>
+            <w:pPr>
+              <w:spacing w:after="40"/>
+              <w:jc w:val="left"/>
+            </w:pPr>
+            <w:r>
+              <w:rPr>
+                <w:b w:val="false"/>
+                <w:bCs w:val="false"/>
+                <w:color w:val="4B5563"/>
+                <w:sz w:val="18"/>
+                <w:szCs w:val="18"/>
+              </w:rPr>
+              <w:t xml:space="preserve">3 short rows</w:t>
+            </w:r>
+          </w:p>
+          <w:p>
+            <w:pPr>
+              <w:spacing w:after="40"/>
+              <w:jc w:val="left"/>
+            </w:pPr>
+            <w:r>
+              <w:rPr>
+                <w:b w:val="false"/>
+                <w:bCs w:val="false"/>
+                <w:color w:val="4B5563"/>
+                <w:sz w:val="18"/>
+                <w:szCs w:val="18"/>
+              </w:rPr>
+              <w:t xml:space="preserve">Works with: tools</w:t>
+            </w:r>
+          </w:p>
+        </w:tc>
+      </w:tr>
+    </w:tbl>
+    <w:p>
+      <w:pPr>
+        <w:spacing w:after="60" w:before="160"/>
+      </w:pPr>
+      <w:r>
+        <w:rPr>
+          <w:b/>
+          <w:bCs/>
+          <w:caps/>
+          <w:color w:val="6B7280"/>
+          <w:sz w:val="17"/>
+          <w:szCs w:val="17"/>
+        </w:rPr>
+        <w:t xml:space="preserve">7. PRIVACY (one line of 4 badges)</w:t>
       </w:r>
     </w:p>
     <w:tbl>
@@ -1408,7 +1694,7 @@
           <w:sz w:val="17"/>
           <w:szCs w:val="17"/>
         </w:rPr>
-        <w:t xml:space="preserve">6. FAQ (4 questions)</w:t>
+        <w:t xml:space="preserve">8. FAQ (4 questions)</w:t>
       </w:r>
     </w:p>
     <w:tbl>
@@ -1524,7 +1810,7 @@
           <w:sz w:val="17"/>
           <w:szCs w:val="17"/>
         </w:rPr>
-        <w:t xml:space="preserve">7. FINAL CTA</w:t>
+        <w:t xml:space="preserve">9. FINAL CTA</w:t>
       </w:r>
     </w:p>
     <w:tbl>
@@ -1841,7 +2127,79 @@
         <w:pStyle w:val="Heading2"/>
       </w:pPr>
       <w:r>
-        <w:t xml:space="preserve">Block 2. How it works</w:t>
+        <w:t xml:space="preserve">Block 2. In simple words</w:t>
+      </w:r>
+    </w:p>
+    <w:p>
+      <w:pPr>
+        <w:pStyle w:val="Heading1"/>
+      </w:pPr>
+      <w:r>
+        <w:t xml:space="preserve">What is voice of customer?</w:t>
+      </w:r>
+    </w:p>
+    <w:p>
+      <w:pPr>
+        <w:spacing w:after="140"/>
+      </w:pPr>
+      <w:r>
+        <w:t xml:space="preserve">Voice of customer means what your customers say, in their own words: what they like, what bothers them, and why they buy. Lynkk records your customer calls and focus groups, so your marketing team can find those exact words later and use them in your messaging.</w:t>
+      </w:r>
+    </w:p>
+    <w:p>
+      <w:pPr>
+        <w:spacing w:after="140"/>
+      </w:pPr>
+      <w:r>
+        <w:rPr>
+          <w:b/>
+          <w:bCs/>
+        </w:rPr>
+        <w:t xml:space="preserve">Who it's for</w:t>
+      </w:r>
+    </w:p>
+    <w:p>
+      <w:pPr>
+        <w:pStyle w:val="ListParagraph"/>
+        <w:numPr>
+          <w:ilvl w:val="0"/>
+          <w:numId w:val="2"/>
+        </w:numPr>
+      </w:pPr>
+      <w:r>
+        <w:t xml:space="preserve">Marketing and product marketing teams</w:t>
+      </w:r>
+    </w:p>
+    <w:p>
+      <w:pPr>
+        <w:pStyle w:val="ListParagraph"/>
+        <w:numPr>
+          <w:ilvl w:val="0"/>
+          <w:numId w:val="2"/>
+        </w:numPr>
+      </w:pPr>
+      <w:r>
+        <w:t xml:space="preserve">Agencies running research for clients</w:t>
+      </w:r>
+    </w:p>
+    <w:p>
+      <w:pPr>
+        <w:pStyle w:val="ListParagraph"/>
+        <w:numPr>
+          <w:ilvl w:val="0"/>
+          <w:numId w:val="2"/>
+        </w:numPr>
+      </w:pPr>
+      <w:r>
+        <w:t xml:space="preserve">Founders writing their own website copy</w:t>
+      </w:r>
+    </w:p>
+    <w:p>
+      <w:pPr>
+        <w:pStyle w:val="Heading2"/>
+      </w:pPr>
+      <w:r>
+        <w:t xml:space="preserve">Block 3. How it works</w:t>
       </w:r>
     </w:p>
     <w:p>
@@ -1894,7 +2252,7 @@
         <w:t xml:space="preserve">Use: quotes with timestamps.</w:t>
       </w:r>
       <w:r>
-        <w:t xml:space="preserve"> Every answer cites the call it came from, so you can hear it again before you quote it.</w:t>
+        <w:t xml:space="preserve"> Every answer shows the call it came from, so you can hear it again before you quote it.</w:t>
       </w:r>
     </w:p>
     <w:p>
@@ -1914,7 +2272,7 @@
         <w:pStyle w:val="Heading2"/>
       </w:pPr>
       <w:r>
-        <w:t xml:space="preserve">Block 3. Sample answer</w:t>
+        <w:t xml:space="preserve">Block 4. Sample answer</w:t>
       </w:r>
     </w:p>
     <w:p>
@@ -1964,7 +2322,7 @@
           <w:b/>
           <w:bCs/>
         </w:rPr>
-        <w:t xml:space="preserve">Cited:</w:t>
+        <w:t xml:space="preserve">Comes from:</w:t>
       </w:r>
       <w:r>
         <w:t xml:space="preserve"> Call with Northwind, 14:05 · Focus group, Pune, 22:40 · Call with Acme, 09:12</w:t>
@@ -1975,7 +2333,7 @@
         <w:pStyle w:val="Heading2"/>
       </w:pPr>
       <w:r>
-        <w:t xml:space="preserve">Block 4. Features</w:t>
+        <w:t xml:space="preserve">Block 5. Features</w:t>
       </w:r>
     </w:p>
     <w:p>
@@ -2051,17 +2409,306 @@
         <w:pStyle w:val="Heading2"/>
       </w:pPr>
       <w:r>
-        <w:t xml:space="preserve">Block 5. Privacy</w:t>
-      </w:r>
+        <w:t xml:space="preserve">Block 6. Before and after</w:t>
+      </w:r>
+    </w:p>
+    <w:p>
+      <w:pPr>
+        <w:pStyle w:val="Heading1"/>
+      </w:pPr>
+      <w:r>
+        <w:t xml:space="preserve">Customer research, before and after Lynkk</w:t>
+      </w:r>
+    </w:p>
+    <w:tbl>
+      <w:tblPr>
+        <w:tblW w:type="dxa" w:w="10080"/>
+        <w:tblBorders>
+          <w:top w:val="single" w:color="auto" w:sz="4"/>
+          <w:left w:val="single" w:color="auto" w:sz="4"/>
+          <w:bottom w:val="single" w:color="auto" w:sz="4"/>
+          <w:right w:val="single" w:color="auto" w:sz="4"/>
+          <w:insideH w:val="single" w:color="auto" w:sz="4"/>
+          <w:insideV w:val="single" w:color="auto" w:sz="4"/>
+        </w:tblBorders>
+      </w:tblPr>
+      <w:tblGrid>
+        <w:gridCol w:w="5040"/>
+        <w:gridCol w:w="5040"/>
+      </w:tblGrid>
+      <w:tr>
+        <w:trPr>
+          <w:tblHeader/>
+        </w:trPr>
+        <w:tc>
+          <w:tcPr>
+            <w:tcW w:type="dxa" w:w="5040"/>
+            <w:tcBorders>
+              <w:top w:val="single" w:color="C9D3DF" w:sz="4"/>
+              <w:left w:val="single" w:color="C9D3DF" w:sz="4"/>
+              <w:bottom w:val="single" w:color="C9D3DF" w:sz="4"/>
+              <w:right w:val="single" w:color="C9D3DF" w:sz="4"/>
+            </w:tcBorders>
+            <w:shd w:fill="1F3A5F" w:color="auto" w:val="clear"/>
+            <w:tcMar>
+              <w:top w:type="dxa" w:w="60"/>
+              <w:left w:type="dxa" w:w="100"/>
+              <w:bottom w:type="dxa" w:w="60"/>
+              <w:right w:type="dxa" w:w="100"/>
+            </w:tcMar>
+          </w:tcPr>
+          <w:p>
+            <w:r>
+              <w:rPr>
+                <w:b/>
+                <w:bCs/>
+                <w:color w:val="FFFFFF"/>
+                <w:sz w:val="19"/>
+                <w:szCs w:val="19"/>
+              </w:rPr>
+              <w:t xml:space="preserve">Without Lynkk</w:t>
+            </w:r>
+          </w:p>
+        </w:tc>
+        <w:tc>
+          <w:tcPr>
+            <w:tcW w:type="dxa" w:w="5040"/>
+            <w:tcBorders>
+              <w:top w:val="single" w:color="C9D3DF" w:sz="4"/>
+              <w:left w:val="single" w:color="C9D3DF" w:sz="4"/>
+              <w:bottom w:val="single" w:color="C9D3DF" w:sz="4"/>
+              <w:right w:val="single" w:color="C9D3DF" w:sz="4"/>
+            </w:tcBorders>
+            <w:shd w:fill="1F3A5F" w:color="auto" w:val="clear"/>
+            <w:tcMar>
+              <w:top w:type="dxa" w:w="60"/>
+              <w:left w:type="dxa" w:w="100"/>
+              <w:bottom w:type="dxa" w:w="60"/>
+              <w:right w:type="dxa" w:w="100"/>
+            </w:tcMar>
+          </w:tcPr>
+          <w:p>
+            <w:r>
+              <w:rPr>
+                <w:b/>
+                <w:bCs/>
+                <w:color w:val="FFFFFF"/>
+                <w:sz w:val="19"/>
+                <w:szCs w:val="19"/>
+              </w:rPr>
+              <w:t xml:space="preserve">With Lynkk</w:t>
+            </w:r>
+          </w:p>
+        </w:tc>
+      </w:tr>
+      <w:tr>
+        <w:trPr>
+          <w:tblHeader w:val="false"/>
+        </w:trPr>
+        <w:tc>
+          <w:tcPr>
+            <w:tcW w:type="dxa" w:w="5040"/>
+            <w:tcBorders>
+              <w:top w:val="single" w:color="C9D3DF" w:sz="4"/>
+              <w:left w:val="single" w:color="C9D3DF" w:sz="4"/>
+              <w:bottom w:val="single" w:color="C9D3DF" w:sz="4"/>
+              <w:right w:val="single" w:color="C9D3DF" w:sz="4"/>
+            </w:tcBorders>
+            <w:tcMar>
+              <w:top w:type="dxa" w:w="60"/>
+              <w:left w:type="dxa" w:w="100"/>
+              <w:bottom w:type="dxa" w:w="60"/>
+              <w:right w:type="dxa" w:w="100"/>
+            </w:tcMar>
+          </w:tcPr>
+          <w:p>
+            <w:r>
+              <w:rPr>
+                <w:sz w:val="19"/>
+                <w:szCs w:val="19"/>
+              </w:rPr>
+              <w:t xml:space="preserve">Customer words live in scattered notes</w:t>
+            </w:r>
+          </w:p>
+        </w:tc>
+        <w:tc>
+          <w:tcPr>
+            <w:tcW w:type="dxa" w:w="5040"/>
+            <w:tcBorders>
+              <w:top w:val="single" w:color="C9D3DF" w:sz="4"/>
+              <w:left w:val="single" w:color="C9D3DF" w:sz="4"/>
+              <w:bottom w:val="single" w:color="C9D3DF" w:sz="4"/>
+              <w:right w:val="single" w:color="C9D3DF" w:sz="4"/>
+            </w:tcBorders>
+            <w:tcMar>
+              <w:top w:type="dxa" w:w="60"/>
+              <w:left w:type="dxa" w:w="100"/>
+              <w:bottom w:type="dxa" w:w="60"/>
+              <w:right w:type="dxa" w:w="100"/>
+            </w:tcMar>
+          </w:tcPr>
+          <w:p>
+            <w:r>
+              <w:rPr>
+                <w:sz w:val="19"/>
+                <w:szCs w:val="19"/>
+              </w:rPr>
+              <w:t xml:space="preserve">Every call is recorded and easy to search</w:t>
+            </w:r>
+          </w:p>
+        </w:tc>
+      </w:tr>
+      <w:tr>
+        <w:trPr>
+          <w:tblHeader w:val="false"/>
+        </w:trPr>
+        <w:tc>
+          <w:tcPr>
+            <w:tcW w:type="dxa" w:w="5040"/>
+            <w:tcBorders>
+              <w:top w:val="single" w:color="C9D3DF" w:sz="4"/>
+              <w:left w:val="single" w:color="C9D3DF" w:sz="4"/>
+              <w:bottom w:val="single" w:color="C9D3DF" w:sz="4"/>
+              <w:right w:val="single" w:color="C9D3DF" w:sz="4"/>
+            </w:tcBorders>
+            <w:tcMar>
+              <w:top w:type="dxa" w:w="60"/>
+              <w:left w:type="dxa" w:w="100"/>
+              <w:bottom w:type="dxa" w:w="60"/>
+              <w:right w:type="dxa" w:w="100"/>
+            </w:tcMar>
+          </w:tcPr>
+          <w:p>
+            <w:r>
+              <w:rPr>
+                <w:sz w:val="19"/>
+                <w:szCs w:val="19"/>
+              </w:rPr>
+              <w:t xml:space="preserve">You guess what customers care about</w:t>
+            </w:r>
+          </w:p>
+        </w:tc>
+        <w:tc>
+          <w:tcPr>
+            <w:tcW w:type="dxa" w:w="5040"/>
+            <w:tcBorders>
+              <w:top w:val="single" w:color="C9D3DF" w:sz="4"/>
+              <w:left w:val="single" w:color="C9D3DF" w:sz="4"/>
+              <w:bottom w:val="single" w:color="C9D3DF" w:sz="4"/>
+              <w:right w:val="single" w:color="C9D3DF" w:sz="4"/>
+            </w:tcBorders>
+            <w:tcMar>
+              <w:top w:type="dxa" w:w="60"/>
+              <w:left w:type="dxa" w:w="100"/>
+              <w:bottom w:type="dxa" w:w="60"/>
+              <w:right w:type="dxa" w:w="100"/>
+            </w:tcMar>
+          </w:tcPr>
+          <w:p>
+            <w:r>
+              <w:rPr>
+                <w:sz w:val="19"/>
+                <w:szCs w:val="19"/>
+              </w:rPr>
+              <w:t xml:space="preserve">You ask Lynkk and see real quotes</w:t>
+            </w:r>
+          </w:p>
+        </w:tc>
+      </w:tr>
+      <w:tr>
+        <w:trPr>
+          <w:tblHeader w:val="false"/>
+        </w:trPr>
+        <w:tc>
+          <w:tcPr>
+            <w:tcW w:type="dxa" w:w="5040"/>
+            <w:tcBorders>
+              <w:top w:val="single" w:color="C9D3DF" w:sz="4"/>
+              <w:left w:val="single" w:color="C9D3DF" w:sz="4"/>
+              <w:bottom w:val="single" w:color="C9D3DF" w:sz="4"/>
+              <w:right w:val="single" w:color="C9D3DF" w:sz="4"/>
+            </w:tcBorders>
+            <w:tcMar>
+              <w:top w:type="dxa" w:w="60"/>
+              <w:left w:type="dxa" w:w="100"/>
+              <w:bottom w:type="dxa" w:w="60"/>
+              <w:right w:type="dxa" w:w="100"/>
+            </w:tcMar>
+          </w:tcPr>
+          <w:p>
+            <w:r>
+              <w:rPr>
+                <w:sz w:val="19"/>
+                <w:szCs w:val="19"/>
+              </w:rPr>
+              <w:t xml:space="preserve">Quotes get changed when people retell them</w:t>
+            </w:r>
+          </w:p>
+        </w:tc>
+        <w:tc>
+          <w:tcPr>
+            <w:tcW w:type="dxa" w:w="5040"/>
+            <w:tcBorders>
+              <w:top w:val="single" w:color="C9D3DF" w:sz="4"/>
+              <w:left w:val="single" w:color="C9D3DF" w:sz="4"/>
+              <w:bottom w:val="single" w:color="C9D3DF" w:sz="4"/>
+              <w:right w:val="single" w:color="C9D3DF" w:sz="4"/>
+            </w:tcBorders>
+            <w:tcMar>
+              <w:top w:type="dxa" w:w="60"/>
+              <w:left w:type="dxa" w:w="100"/>
+              <w:bottom w:type="dxa" w:w="60"/>
+              <w:right w:type="dxa" w:w="100"/>
+            </w:tcMar>
+          </w:tcPr>
+          <w:p>
+            <w:r>
+              <w:rPr>
+                <w:sz w:val="19"/>
+                <w:szCs w:val="19"/>
+              </w:rPr>
+              <w:t xml:space="preserve">You hear the exact words before you use them</w:t>
+            </w:r>
+          </w:p>
+        </w:tc>
+      </w:tr>
+    </w:tbl>
+    <w:p>
+      <w:pPr>
+        <w:spacing w:after="120"/>
+      </w:pPr>
     </w:p>
     <w:p>
       <w:pPr>
         <w:spacing w:after="140"/>
       </w:pPr>
       <w:r>
+        <w:rPr>
+          <w:b/>
+          <w:bCs/>
+        </w:rPr>
+        <w:t xml:space="preserve">Works with:</w:t>
+      </w:r>
+      <w:r>
+        <w:t xml:space="preserve"> Zoom, Google Meet, Microsoft Teams, and the Mac app for focus groups in the room.</w:t>
+      </w:r>
+    </w:p>
+    <w:p>
+      <w:pPr>
+        <w:pStyle w:val="Heading2"/>
+      </w:pPr>
+      <w:r>
+        <w:t xml:space="preserve">Block 7. Privacy</w:t>
+      </w:r>
+    </w:p>
+    <w:p>
+      <w:pPr>
+        <w:spacing w:after="140"/>
+      </w:pPr>
+      <w:r>
         <w:t xml:space="preserve">Your data region (US, EU, UK, India, Singapore or Australia) · AES-256 encryption · Never used for training · Consent flow for recording. </w:t>
       </w:r>
-      <w:hyperlink w:history="1" r:id="rIdvabpvohf5dz9iwm1dxqjt">
+      <w:hyperlink w:history="1" r:id="rIdn-ivu5sdidvwsenpxakqi">
         <w:r>
           <w:rPr>
             <w:rStyle w:val="Hyperlink"/>
@@ -2075,7 +2722,7 @@
         <w:pStyle w:val="Heading2"/>
       </w:pPr>
       <w:r>
-        <w:t xml:space="preserve">Block 6. FAQ</w:t>
+        <w:t xml:space="preserve">Block 8. FAQ</w:t>
       </w:r>
     </w:p>
     <w:p>
@@ -2123,7 +2770,7 @@
         <w:spacing w:after="140"/>
       </w:pPr>
       <w:r>
-        <w:t xml:space="preserve">No. There's no tagging board. On Pro, you ask questions across your notes and get answers with citations.</w:t>
+        <w:t xml:space="preserve">No. There's no tagging board. On Pro, you ask questions across your notes and see where each answer came from.</w:t>
       </w:r>
     </w:p>
     <w:p>
@@ -2171,7 +2818,7 @@
         <w:pStyle w:val="Heading2"/>
       </w:pPr>
       <w:r>
-        <w:t xml:space="preserve">Block 7. Final CTA</w:t>
+        <w:t xml:space="preserve">Block 9. Final CTA</w:t>
       </w:r>
     </w:p>
     <w:p>

</xml_diff>

<commit_message>
Add a simple Free vs Pro pricing block to all use-case pages
Covers comparison items 2, 3, 4 and 13 on every page. Rebuilds the
client content, comparison and per-page Word files.

Co-Authored-By: Claude Opus 5.5 <noreply@anthropic.com>
Claude-Session: https://claude.ai/code/session_01Xs6uEGTRa4UggVmKjUH61X
</commit_message>
<xml_diff>
--- a/content/use-cases/lynkk-customer-research-page-short.docx
+++ b/content/use-cases/lynkk-customer-research-page-short.docx
@@ -544,7 +544,7 @@
         <w:spacing w:after="140"/>
       </w:pPr>
       <w:r>
-        <w:t xml:space="preserve">9 blocks, about 660 words. One centred column, white background, light grey cards. Columns stack on mobile.</w:t>
+        <w:t xml:space="preserve">10 blocks, about 720 words. One centred column, white background, light grey cards. Columns stack on mobile.</w:t>
       </w:r>
     </w:p>
     <w:p>
@@ -1694,7 +1694,174 @@
           <w:sz w:val="17"/>
           <w:szCs w:val="17"/>
         </w:rPr>
-        <w:t xml:space="preserve">8. FAQ (4 questions)</w:t>
+        <w:t xml:space="preserve">8. PRICING (2 columns)</w:t>
+      </w:r>
+    </w:p>
+    <w:tbl>
+      <w:tblPr>
+        <w:tblW w:type="dxa" w:w="10080"/>
+        <w:tblBorders>
+          <w:top w:val="single" w:color="auto" w:sz="4"/>
+          <w:left w:val="single" w:color="auto" w:sz="4"/>
+          <w:bottom w:val="single" w:color="auto" w:sz="4"/>
+          <w:right w:val="single" w:color="auto" w:sz="4"/>
+          <w:insideH w:val="single" w:color="auto" w:sz="4"/>
+          <w:insideV w:val="single" w:color="auto" w:sz="4"/>
+        </w:tblBorders>
+      </w:tblPr>
+      <w:tblGrid>
+        <w:gridCol w:w="5040"/>
+        <w:gridCol w:w="5040"/>
+      </w:tblGrid>
+      <w:tr>
+        <w:tc>
+          <w:tcPr>
+            <w:tcW w:type="dxa" w:w="5040"/>
+            <w:tcBorders>
+              <w:top w:val="dashed" w:color="9CA3AF" w:sz="6"/>
+              <w:left w:val="dashed" w:color="9CA3AF" w:sz="6"/>
+              <w:bottom w:val="dashed" w:color="9CA3AF" w:sz="6"/>
+              <w:right w:val="dashed" w:color="9CA3AF" w:sz="6"/>
+            </w:tcBorders>
+            <w:shd w:fill="F5F6F8" w:color="auto" w:val="clear"/>
+            <w:tcMar>
+              <w:top w:type="dxa" w:w="100"/>
+              <w:left w:type="dxa" w:w="120"/>
+              <w:bottom w:type="dxa" w:w="100"/>
+              <w:right w:type="dxa" w:w="120"/>
+            </w:tcMar>
+          </w:tcPr>
+          <w:p>
+            <w:pPr>
+              <w:spacing w:after="40"/>
+              <w:jc w:val="left"/>
+            </w:pPr>
+            <w:r>
+              <w:rPr>
+                <w:b/>
+                <w:bCs/>
+                <w:color w:val="1F3A5F"/>
+                <w:sz w:val="18"/>
+                <w:szCs w:val="18"/>
+              </w:rPr>
+              <w:t xml:space="preserve">FREE</w:t>
+            </w:r>
+          </w:p>
+          <w:p>
+            <w:pPr>
+              <w:spacing w:after="40"/>
+              <w:jc w:val="left"/>
+            </w:pPr>
+            <w:r>
+              <w:rPr>
+                <w:b w:val="false"/>
+                <w:bCs w:val="false"/>
+                <w:color w:val="4B5563"/>
+                <w:sz w:val="18"/>
+                <w:szCs w:val="18"/>
+              </w:rPr>
+              <w:t xml:space="preserve">$0</w:t>
+            </w:r>
+          </w:p>
+          <w:p>
+            <w:pPr>
+              <w:spacing w:after="40"/>
+              <w:jc w:val="left"/>
+            </w:pPr>
+            <w:r>
+              <w:rPr>
+                <w:b w:val="false"/>
+                <w:bCs w:val="false"/>
+                <w:color w:val="4B5563"/>
+                <w:sz w:val="18"/>
+                <w:szCs w:val="18"/>
+              </w:rPr>
+              <w:t xml:space="preserve">Notes and action items</w:t>
+            </w:r>
+          </w:p>
+        </w:tc>
+        <w:tc>
+          <w:tcPr>
+            <w:tcW w:type="dxa" w:w="5040"/>
+            <w:tcBorders>
+              <w:top w:val="dashed" w:color="9CA3AF" w:sz="6"/>
+              <w:left w:val="dashed" w:color="9CA3AF" w:sz="6"/>
+              <w:bottom w:val="dashed" w:color="9CA3AF" w:sz="6"/>
+              <w:right w:val="dashed" w:color="9CA3AF" w:sz="6"/>
+            </w:tcBorders>
+            <w:shd w:fill="F5F6F8" w:color="auto" w:val="clear"/>
+            <w:tcMar>
+              <w:top w:type="dxa" w:w="100"/>
+              <w:left w:type="dxa" w:w="120"/>
+              <w:bottom w:type="dxa" w:w="100"/>
+              <w:right w:type="dxa" w:w="120"/>
+            </w:tcMar>
+          </w:tcPr>
+          <w:p>
+            <w:pPr>
+              <w:spacing w:after="40"/>
+              <w:jc w:val="left"/>
+            </w:pPr>
+            <w:r>
+              <w:rPr>
+                <w:b/>
+                <w:bCs/>
+                <w:color w:val="1F3A5F"/>
+                <w:sz w:val="18"/>
+                <w:szCs w:val="18"/>
+              </w:rPr>
+              <w:t xml:space="preserve">PRO</w:t>
+            </w:r>
+          </w:p>
+          <w:p>
+            <w:pPr>
+              <w:spacing w:after="40"/>
+              <w:jc w:val="left"/>
+            </w:pPr>
+            <w:r>
+              <w:rPr>
+                <w:b w:val="false"/>
+                <w:bCs w:val="false"/>
+                <w:color w:val="4B5563"/>
+                <w:sz w:val="18"/>
+                <w:szCs w:val="18"/>
+              </w:rPr>
+              <w:t xml:space="preserve">$15 a month</w:t>
+            </w:r>
+          </w:p>
+          <w:p>
+            <w:pPr>
+              <w:spacing w:after="40"/>
+              <w:jc w:val="left"/>
+            </w:pPr>
+            <w:r>
+              <w:rPr>
+                <w:b w:val="false"/>
+                <w:bCs w:val="false"/>
+                <w:color w:val="4B5563"/>
+                <w:sz w:val="18"/>
+                <w:szCs w:val="18"/>
+              </w:rPr>
+              <w:t xml:space="preserve">Unlimited notes + Pro features</w:t>
+            </w:r>
+          </w:p>
+        </w:tc>
+      </w:tr>
+    </w:tbl>
+    <w:p>
+      <w:pPr>
+        <w:spacing w:after="60" w:before="160"/>
+      </w:pPr>
+      <w:r>
+        <w:rPr>
+          <w:b/>
+          <w:bCs/>
+          <w:caps/>
+          <w:color w:val="6B7280"/>
+          <w:sz w:val="17"/>
+          <w:szCs w:val="17"/>
+        </w:rPr>
+        <w:t xml:space="preserve">9. FAQ (4 questions)</w:t>
       </w:r>
     </w:p>
     <w:tbl>
@@ -1810,7 +1977,7 @@
           <w:sz w:val="17"/>
           <w:szCs w:val="17"/>
         </w:rPr>
-        <w:t xml:space="preserve">9. FINAL CTA</w:t>
+        <w:t xml:space="preserve">10. FINAL CTA</w:t>
       </w:r>
     </w:p>
     <w:tbl>
@@ -2708,7 +2875,7 @@
       <w:r>
         <w:t xml:space="preserve">Your data region (US, EU, UK, India, Singapore or Australia) · AES-256 encryption · Never used for training · Consent flow for recording. </w:t>
       </w:r>
-      <w:hyperlink w:history="1" r:id="rIdn-ivu5sdidvwsenpxakqi">
+      <w:hyperlink w:history="1" r:id="rIdrwnf8sumbl6yk4hosn4pr">
         <w:r>
           <w:rPr>
             <w:rStyle w:val="Hyperlink"/>
@@ -2722,7 +2889,237 @@
         <w:pStyle w:val="Heading2"/>
       </w:pPr>
       <w:r>
-        <w:t xml:space="preserve">Block 8. FAQ</w:t>
+        <w:t xml:space="preserve">Block 8. Pricing</w:t>
+      </w:r>
+    </w:p>
+    <w:p>
+      <w:pPr>
+        <w:pStyle w:val="Heading1"/>
+      </w:pPr>
+      <w:r>
+        <w:t xml:space="preserve">Simple pricing</w:t>
+      </w:r>
+    </w:p>
+    <w:tbl>
+      <w:tblPr>
+        <w:tblW w:type="dxa" w:w="10080"/>
+        <w:tblBorders>
+          <w:top w:val="single" w:color="auto" w:sz="4"/>
+          <w:left w:val="single" w:color="auto" w:sz="4"/>
+          <w:bottom w:val="single" w:color="auto" w:sz="4"/>
+          <w:right w:val="single" w:color="auto" w:sz="4"/>
+          <w:insideH w:val="single" w:color="auto" w:sz="4"/>
+          <w:insideV w:val="single" w:color="auto" w:sz="4"/>
+        </w:tblBorders>
+      </w:tblPr>
+      <w:tblGrid>
+        <w:gridCol w:w="5040"/>
+        <w:gridCol w:w="5040"/>
+      </w:tblGrid>
+      <w:tr>
+        <w:trPr>
+          <w:tblHeader/>
+        </w:trPr>
+        <w:tc>
+          <w:tcPr>
+            <w:tcW w:type="dxa" w:w="5040"/>
+            <w:tcBorders>
+              <w:top w:val="single" w:color="C9D3DF" w:sz="4"/>
+              <w:left w:val="single" w:color="C9D3DF" w:sz="4"/>
+              <w:bottom w:val="single" w:color="C9D3DF" w:sz="4"/>
+              <w:right w:val="single" w:color="C9D3DF" w:sz="4"/>
+            </w:tcBorders>
+            <w:shd w:fill="1F3A5F" w:color="auto" w:val="clear"/>
+            <w:tcMar>
+              <w:top w:type="dxa" w:w="60"/>
+              <w:left w:type="dxa" w:w="100"/>
+              <w:bottom w:type="dxa" w:w="60"/>
+              <w:right w:type="dxa" w:w="100"/>
+            </w:tcMar>
+          </w:tcPr>
+          <w:p>
+            <w:r>
+              <w:rPr>
+                <w:b/>
+                <w:bCs/>
+                <w:color w:val="FFFFFF"/>
+                <w:sz w:val="19"/>
+                <w:szCs w:val="19"/>
+              </w:rPr>
+              <w:t xml:space="preserve">Free</w:t>
+            </w:r>
+          </w:p>
+        </w:tc>
+        <w:tc>
+          <w:tcPr>
+            <w:tcW w:type="dxa" w:w="5040"/>
+            <w:tcBorders>
+              <w:top w:val="single" w:color="C9D3DF" w:sz="4"/>
+              <w:left w:val="single" w:color="C9D3DF" w:sz="4"/>
+              <w:bottom w:val="single" w:color="C9D3DF" w:sz="4"/>
+              <w:right w:val="single" w:color="C9D3DF" w:sz="4"/>
+            </w:tcBorders>
+            <w:shd w:fill="1F3A5F" w:color="auto" w:val="clear"/>
+            <w:tcMar>
+              <w:top w:type="dxa" w:w="60"/>
+              <w:left w:type="dxa" w:w="100"/>
+              <w:bottom w:type="dxa" w:w="60"/>
+              <w:right w:type="dxa" w:w="100"/>
+            </w:tcMar>
+          </w:tcPr>
+          <w:p>
+            <w:r>
+              <w:rPr>
+                <w:b/>
+                <w:bCs/>
+                <w:color w:val="FFFFFF"/>
+                <w:sz w:val="19"/>
+                <w:szCs w:val="19"/>
+              </w:rPr>
+              <w:t xml:space="preserve">Pro</w:t>
+            </w:r>
+          </w:p>
+        </w:tc>
+      </w:tr>
+      <w:tr>
+        <w:trPr>
+          <w:tblHeader w:val="false"/>
+        </w:trPr>
+        <w:tc>
+          <w:tcPr>
+            <w:tcW w:type="dxa" w:w="5040"/>
+            <w:tcBorders>
+              <w:top w:val="single" w:color="C9D3DF" w:sz="4"/>
+              <w:left w:val="single" w:color="C9D3DF" w:sz="4"/>
+              <w:bottom w:val="single" w:color="C9D3DF" w:sz="4"/>
+              <w:right w:val="single" w:color="C9D3DF" w:sz="4"/>
+            </w:tcBorders>
+            <w:tcMar>
+              <w:top w:type="dxa" w:w="60"/>
+              <w:left w:type="dxa" w:w="100"/>
+              <w:bottom w:type="dxa" w:w="60"/>
+              <w:right w:type="dxa" w:w="100"/>
+            </w:tcMar>
+          </w:tcPr>
+          <w:p>
+            <w:r>
+              <w:rPr>
+                <w:sz w:val="19"/>
+                <w:szCs w:val="19"/>
+              </w:rPr>
+              <w:t xml:space="preserve">$0</w:t>
+            </w:r>
+          </w:p>
+        </w:tc>
+        <w:tc>
+          <w:tcPr>
+            <w:tcW w:type="dxa" w:w="5040"/>
+            <w:tcBorders>
+              <w:top w:val="single" w:color="C9D3DF" w:sz="4"/>
+              <w:left w:val="single" w:color="C9D3DF" w:sz="4"/>
+              <w:bottom w:val="single" w:color="C9D3DF" w:sz="4"/>
+              <w:right w:val="single" w:color="C9D3DF" w:sz="4"/>
+            </w:tcBorders>
+            <w:tcMar>
+              <w:top w:type="dxa" w:w="60"/>
+              <w:left w:type="dxa" w:w="100"/>
+              <w:bottom w:type="dxa" w:w="60"/>
+              <w:right w:type="dxa" w:w="100"/>
+            </w:tcMar>
+          </w:tcPr>
+          <w:p>
+            <w:r>
+              <w:rPr>
+                <w:sz w:val="19"/>
+                <w:szCs w:val="19"/>
+              </w:rPr>
+              <w:t xml:space="preserve">$15 a month</w:t>
+            </w:r>
+          </w:p>
+        </w:tc>
+      </w:tr>
+      <w:tr>
+        <w:trPr>
+          <w:tblHeader w:val="false"/>
+        </w:trPr>
+        <w:tc>
+          <w:tcPr>
+            <w:tcW w:type="dxa" w:w="5040"/>
+            <w:tcBorders>
+              <w:top w:val="single" w:color="C9D3DF" w:sz="4"/>
+              <w:left w:val="single" w:color="C9D3DF" w:sz="4"/>
+              <w:bottom w:val="single" w:color="C9D3DF" w:sz="4"/>
+              <w:right w:val="single" w:color="C9D3DF" w:sz="4"/>
+            </w:tcBorders>
+            <w:tcMar>
+              <w:top w:type="dxa" w:w="60"/>
+              <w:left w:type="dxa" w:w="100"/>
+              <w:bottom w:type="dxa" w:w="60"/>
+              <w:right w:type="dxa" w:w="100"/>
+            </w:tcMar>
+          </w:tcPr>
+          <w:p>
+            <w:r>
+              <w:rPr>
+                <w:sz w:val="19"/>
+                <w:szCs w:val="19"/>
+              </w:rPr>
+              <w:t xml:space="preserve">Record meetings and get AI notes and action items. No credit card.</w:t>
+            </w:r>
+          </w:p>
+        </w:tc>
+        <w:tc>
+          <w:tcPr>
+            <w:tcW w:type="dxa" w:w="5040"/>
+            <w:tcBorders>
+              <w:top w:val="single" w:color="C9D3DF" w:sz="4"/>
+              <w:left w:val="single" w:color="C9D3DF" w:sz="4"/>
+              <w:bottom w:val="single" w:color="C9D3DF" w:sz="4"/>
+              <w:right w:val="single" w:color="C9D3DF" w:sz="4"/>
+            </w:tcBorders>
+            <w:tcMar>
+              <w:top w:type="dxa" w:w="60"/>
+              <w:left w:type="dxa" w:w="100"/>
+              <w:bottom w:type="dxa" w:w="60"/>
+              <w:right w:type="dxa" w:w="100"/>
+            </w:tcMar>
+          </w:tcPr>
+          <w:p>
+            <w:r>
+              <w:rPr>
+                <w:sz w:val="19"/>
+                <w:szCs w:val="19"/>
+              </w:rPr>
+              <w:t xml:space="preserve">Unlimited notes, plus Ask Lynkk across every customer call, and the Customer Interview note format.</w:t>
+            </w:r>
+          </w:p>
+        </w:tc>
+      </w:tr>
+    </w:tbl>
+    <w:p>
+      <w:pPr>
+        <w:spacing w:after="120"/>
+      </w:pPr>
+    </w:p>
+    <w:p>
+      <w:pPr>
+        <w:spacing w:after="140"/>
+      </w:pPr>
+      <w:hyperlink w:history="1" r:id="rId7i9r41fspxeotsifi1x5m">
+        <w:r>
+          <w:rPr>
+            <w:rStyle w:val="Hyperlink"/>
+          </w:rPr>
+          <w:t xml:space="preserve">Compare plans</w:t>
+        </w:r>
+      </w:hyperlink>
+    </w:p>
+    <w:p>
+      <w:pPr>
+        <w:pStyle w:val="Heading2"/>
+      </w:pPr>
+      <w:r>
+        <w:t xml:space="preserve">Block 9. FAQ</w:t>
       </w:r>
     </w:p>
     <w:p>
@@ -2818,7 +3215,7 @@
         <w:pStyle w:val="Heading2"/>
       </w:pPr>
       <w:r>
-        <w:t xml:space="preserve">Block 9. Final CTA</w:t>
+        <w:t xml:space="preserve">Block 10. Final CTA</w:t>
       </w:r>
     </w:p>
     <w:p>
@@ -2886,6 +3283,18 @@
           <w:szCs w:val="19"/>
         </w:rPr>
         <w:t xml:space="preserve">/use-cases/user-interviews</w:t>
+      </w:r>
+    </w:p>
+    <w:p>
+      <w:pPr>
+        <w:pStyle w:val="ListParagraph"/>
+        <w:numPr>
+          <w:ilvl w:val="0"/>
+          <w:numId w:val="2"/>
+        </w:numPr>
+      </w:pPr>
+      <w:r>
+        <w:t xml:space="preserve">Pricing block: confirm the free plan limit before adding a number (the site gives three versions)</w:t>
       </w:r>
     </w:p>
     <w:sectPr>

</xml_diff>